<commit_message>
Refresh email draft Word with test64 preferred handout.
</commit_message>
<xml_diff>
--- a/paper/EMAIL_DRAFT_ALEXANDER_updated.docx
+++ b/paper/EMAIL_DRAFT_ALEXANDER_updated.docx
@@ -88,143 +88,10 @@
     <w:p>
       <w:r>
         <w:rPr>
-          <w:b/>
-          <w:sz w:val="22"/>
-        </w:rPr>
-        <w:t>Algorithm (one paragraph):</w:t>
-      </w:r>
-    </w:p>
-    <w:p>
-      <w:r>
-        <w:rPr>
           <w:b w:val="0"/>
           <w:sz w:val="22"/>
         </w:rPr>
-        <w:t>Unknown seed in a spectral ego-network (GraphML + MGF) → hide seed structure → rank neighbors → optional neighbor-only NIST (seed never library-searched) → free-form LLM reasons MASS→NETWORK→MS/MS→CHEMISTRY→DECISION and outputs one SMILES JSON — scored offline vs sealed truth (IK1 / exact SMILES / formula / Tanimoto). Deterministic mass-OK ranker is a separate ablation. For MassSpecGym HNSW, seed node is always 9999999; link to MSG is by file-order index N. Official train/val/test folds come from the MSG index after that join (not from GraphML).</w:t>
-      </w:r>
-    </w:p>
-    <w:p>
-      <w:r>
-        <w:rPr>
-          <w:b/>
-          <w:sz w:val="22"/>
-        </w:rPr>
-        <w:t>What is ready:</w:t>
-      </w:r>
-    </w:p>
-    <w:p>
-      <w:pPr>
-        <w:pStyle w:val="ListNumber"/>
-      </w:pPr>
-      <w:r>
-        <w:t>Strict blind 285 pack (HNSW-available MSG subset) + sealed truth + neighbor-NIST prompts.</w:t>
-      </w:r>
-    </w:p>
-    <w:p>
-      <w:pPr>
-        <w:pStyle w:val="ListNumber"/>
-      </w:pPr>
-      <w:r>
-        <w:t>Full 11,540 HNSW block handout with neighbor NIST precomputed + sealed truth + Grok prompt zip (~89 MB).</w:t>
-      </w:r>
-    </w:p>
-    <w:p>
-      <w:pPr>
-        <w:pStyle w:val="ListNumber"/>
-      </w:pPr>
-      <w:r>
-        <w:t>IK1-deduped handout (n=1780) — train/val/test = 1652/75/53 — preferred free-form API set + Grok zip.</w:t>
-      </w:r>
-    </w:p>
-    <w:p>
-      <w:pPr>
-        <w:pStyle w:val="ListNumber"/>
-      </w:pPr>
-      <w:r>
-        <w:t>QC: index-N link 100% PEPMASS match; redundancy ~6.5× spectra per molecule on full pack.</w:t>
-      </w:r>
-    </w:p>
-    <w:p>
-      <w:pPr>
-        <w:pStyle w:val="ListNumber"/>
-      </w:pPr>
-      <w:r>
-        <w:t>Local runners (Ollama) + product ranker + dedupe scripts in repo.</w:t>
-      </w:r>
-    </w:p>
-    <w:p>
-      <w:r>
-        <w:rPr>
-          <w:b/>
-          <w:sz w:val="22"/>
-        </w:rPr>
-        <w:t>Important caveats (please stress to the student):</w:t>
-      </w:r>
-    </w:p>
-    <w:p>
-      <w:pPr>
-        <w:pStyle w:val="ListNumber"/>
-      </w:pPr>
-      <w:r>
-        <w:t>11,540 ≠ official MSG test (17,556). Under official MSG folds this block is mostly train (11,386 / 90 / 64). We will re-run when fuller HNSW coverage of the true test fold is available.</w:t>
-      </w:r>
-    </w:p>
-    <w:p>
-      <w:pPr>
-        <w:pStyle w:val="ListNumber"/>
-      </w:pPr>
-      <w:r>
-        <w:t>Several fast Grok full pack returns are invalid free-form (bulk mass-fit / m/z cluster in minutes). Do not put them in free-form tables. Credible free-form baseline on 285: Grok ~36% IK1 without neighbor NIST. Claude pilot ~86% on 64/285 then stopped (~8M tokens). Qwen local ~14% on 87/285 partial.</w:t>
-      </w:r>
-    </w:p>
-    <w:p>
-      <w:pPr>
-        <w:pStyle w:val="ListNumber"/>
-      </w:pPr>
-      <w:r>
-        <w:t>Prefer free-form on the deduped pack (n=1780) already built (MSG_HNSW_dedup_ik1_nist_neigh_*); full 11,540 is for spectrum-level ranker ablations. Cost order on 1780 is ~6× lower than 11,540.</w:t>
-      </w:r>
-    </w:p>
-    <w:p>
-      <w:r>
-        <w:rPr>
-          <w:b/>
-          <w:sz w:val="22"/>
-        </w:rPr>
-        <w:t>Student asks:</w:t>
-      </w:r>
-    </w:p>
-    <w:p>
-      <w:pPr>
-        <w:pStyle w:val="ListNumber"/>
-      </w:pPr>
-      <w:r>
-        <w:t>Finish ranker + free-form tables on frozen packs (spectrum + unique-molecule metrics).</w:t>
-      </w:r>
-    </w:p>
-    <w:p>
-      <w:pPr>
-        <w:pStyle w:val="ListNumber"/>
-      </w:pPr>
-      <w:r>
-        <w:t>Keep free-form vs ranker vs invalid bulk in separate columns.</w:t>
-      </w:r>
-    </w:p>
-    <w:p>
-      <w:pPr>
-        <w:pStyle w:val="ListNumber"/>
-      </w:pPr>
-      <w:r>
-        <w:t>Coordinate API budget with you; I can help wire the batch runner if needed.</w:t>
-      </w:r>
-    </w:p>
-    <w:p>
-      <w:r>
-        <w:rPr>
-          <w:b w:val="0"/>
-          <w:sz w:val="22"/>
-        </w:rPr>
-        <w:t>Happy to jump on a short call with you + the student to walk through folder layout and scoring.</w:t>
+        <w:t>Preferred free-form handout: test-only n=64 (original test count, no IK1 dedupe) — Desktop MSG_HNSW_test64_nist_neigh_* (+ Grok zip).</w:t>
       </w:r>
     </w:p>
     <w:p>

</xml_diff>

<commit_message>
Update Alexander email with Grok test64 free-form results summary.
</commit_message>
<xml_diff>
--- a/paper/EMAIL_DRAFT_ALEXANDER_updated.docx
+++ b/paper/EMAIL_DRAFT_ALEXANDER_updated.docx
@@ -3,29 +3,10 @@
 <w:document xmlns:wpc="http://schemas.microsoft.com/office/word/2010/wordprocessingCanvas" xmlns:mo="http://schemas.microsoft.com/office/mac/office/2008/main" xmlns:mc="http://schemas.openxmlformats.org/markup-compatibility/2006" xmlns:mv="urn:schemas-microsoft-com:mac:vml" xmlns:o="urn:schemas-microsoft-com:office:office" xmlns:r="http://schemas.openxmlformats.org/officeDocument/2006/relationships" xmlns:m="http://schemas.openxmlformats.org/officeDocument/2006/math" xmlns:v="urn:schemas-microsoft-com:vml" xmlns:wp14="http://schemas.microsoft.com/office/word/2010/wordprocessingDrawing" xmlns:wp="http://schemas.openxmlformats.org/drawingml/2006/wordprocessingDrawing" xmlns:w10="urn:schemas-microsoft-com:office:word" xmlns:w="http://schemas.openxmlformats.org/wordprocessingml/2006/main" xmlns:w14="http://schemas.microsoft.com/office/word/2010/wordml" xmlns:wpg="http://schemas.microsoft.com/office/word/2010/wordprocessingGroup" xmlns:wpi="http://schemas.microsoft.com/office/word/2010/wordprocessingInk" xmlns:wne="http://schemas.microsoft.com/office/word/2006/wordml" xmlns:wps="http://schemas.microsoft.com/office/word/2010/wordprocessingShape" mc:Ignorable="w14 wp14">
   <w:body>
     <w:p>
-      <w:pPr>
-        <w:pStyle w:val="Title"/>
-        <w:jc w:val="left"/>
-      </w:pPr>
-      <w:r>
-        <w:t>Draft email to Alexander</w:t>
-      </w:r>
-    </w:p>
-    <w:p>
-      <w:r>
-        <w:rPr>
-          <w:i/>
-          <w:color w:val="555555"/>
-          <w:sz w:val="20"/>
-        </w:rPr>
-        <w:t>Forward to student for finishing benchmarks.</w:t>
-      </w:r>
-    </w:p>
-    <w:p>
       <w:r>
         <w:rPr>
           <w:b/>
-          <w:sz w:val="22"/>
+          <w:i w:val="0"/>
         </w:rPr>
         <w:t>Subject:</w:t>
       </w:r>
@@ -34,9 +15,9 @@
       <w:r>
         <w:rPr>
           <w:b w:val="0"/>
-          <w:sz w:val="22"/>
+          <w:i w:val="0"/>
         </w:rPr>
-        <w:t>ego-mol-llm handoff — frozen protocol, packs, results board, student benchmarks TODO</w:t>
+        <w:t>ego-mol-llm — Grok free-form results on MSG HNSW test64 (Claude running next)</w:t>
       </w:r>
     </w:p>
     <w:p/>
@@ -44,7 +25,7 @@
       <w:r>
         <w:rPr>
           <w:b w:val="0"/>
-          <w:sz w:val="22"/>
+          <w:i w:val="0"/>
         </w:rPr>
         <w:t>Hi Alexander,</w:t>
       </w:r>
@@ -53,52 +34,470 @@
       <w:r>
         <w:rPr>
           <w:b w:val="0"/>
-          <w:sz w:val="22"/>
+          <w:i w:val="0"/>
         </w:rPr>
-        <w:t>Please pass this package to your student to finish the benchmarks for the network + free-form LLM MS/MS structure paper. Product path, blind packs, and evaluation protocol are frozen on my side; remaining work is clean scoring tables and completing free-form / ranker arms under the same rules.</w:t>
+        <w:t>Quick update for you + the student. Protocol and packs are frozen; we now have a scored free-form Grok run on the preferred small set (official MSG fold=test spectra inside our HNSW dump, n = 64, no IK1 dedupe). Claude free-form on the same 64 is running now — I will send numbers when it finishes.</w:t>
       </w:r>
     </w:p>
     <w:p>
+      <w:pPr>
+        <w:pStyle w:val="Heading1"/>
+      </w:pPr>
       <w:r>
-        <w:rPr>
-          <w:b/>
-          <w:sz w:val="22"/>
-        </w:rPr>
-        <w:t>Repo:</w:t>
+        <w:t>Latest result (primary arm to cite)</w:t>
       </w:r>
     </w:p>
     <w:p>
       <w:r>
         <w:rPr>
           <w:b w:val="0"/>
-          <w:sz w:val="22"/>
+          <w:i w:val="0"/>
         </w:rPr>
-        <w:t>https://github.com/Melin2012/ego-mol-llm</w:t>
+        <w:t>Pack: MSG_HNSW_test64_nist_neigh_*</w:t>
       </w:r>
     </w:p>
     <w:p>
       <w:r>
         <w:rPr>
           <w:b w:val="0"/>
-          <w:sz w:val="22"/>
+          <w:i w:val="0"/>
         </w:rPr>
-        <w:t>Key docs (also as Word files in paper/): METHODS.docx, RESULTS_BOARD.docx, HANDOFF_ALEXANDER.docx.</w:t>
+        <w:t>Model arm: Grok free-form + neighbor-only NIST (seed never library-searched)</w:t>
       </w:r>
     </w:p>
     <w:p>
       <w:r>
         <w:rPr>
           <w:b w:val="0"/>
-          <w:sz w:val="22"/>
+          <w:i w:val="0"/>
         </w:rPr>
-        <w:t>Preferred free-form handout: test-only n=64 (original test count, no IK1 dedupe) — Desktop MSG_HNSW_test64_nist_neigh_* (+ Grok zip).</w:t>
+        <w:t>Validity: valid free-form (per-sample reasoning, ~40 min pack span, mass-first; not the old bulk/m/z-cluster dumps)</w:t>
+      </w:r>
+    </w:p>
+    <w:tbl>
+      <w:tblPr>
+        <w:tblStyle w:val="TableGrid"/>
+        <w:tblW w:type="auto" w:w="0"/>
+        <w:tblLook w:firstColumn="1" w:firstRow="1" w:lastColumn="0" w:lastRow="0" w:noHBand="0" w:noVBand="1" w:val="04A0"/>
+      </w:tblPr>
+      <w:tblGrid>
+        <w:gridCol w:w="4320"/>
+        <w:gridCol w:w="4320"/>
+      </w:tblGrid>
+      <w:tr>
+        <w:tc>
+          <w:tcPr>
+            <w:tcW w:type="dxa" w:w="4320"/>
+          </w:tcPr>
+          <w:p>
+            <w:r>
+              <w:rPr>
+                <w:b/>
+              </w:rPr>
+              <w:t>Metric</w:t>
+            </w:r>
+          </w:p>
+        </w:tc>
+        <w:tc>
+          <w:tcPr>
+            <w:tcW w:type="dxa" w:w="4320"/>
+          </w:tcPr>
+          <w:p>
+            <w:r>
+              <w:rPr>
+                <w:b/>
+              </w:rPr>
+              <w:t>Grok free-form (test64)</w:t>
+            </w:r>
+          </w:p>
+        </w:tc>
+      </w:tr>
+      <w:tr>
+        <w:tc>
+          <w:tcPr>
+            <w:tcW w:type="dxa" w:w="4320"/>
+          </w:tcPr>
+          <w:p>
+            <w:r>
+              <w:t>n</w:t>
+            </w:r>
+          </w:p>
+        </w:tc>
+        <w:tc>
+          <w:tcPr>
+            <w:tcW w:type="dxa" w:w="4320"/>
+          </w:tcPr>
+          <w:p>
+            <w:r>
+              <w:t>64 (0 missing)</w:t>
+            </w:r>
+          </w:p>
+        </w:tc>
+      </w:tr>
+      <w:tr>
+        <w:tc>
+          <w:tcPr>
+            <w:tcW w:type="dxa" w:w="4320"/>
+          </w:tcPr>
+          <w:p>
+            <w:r>
+              <w:t>Structure hit (exact SMILES or IK1)</w:t>
+            </w:r>
+          </w:p>
+        </w:tc>
+        <w:tc>
+          <w:tcPr>
+            <w:tcW w:type="dxa" w:w="4320"/>
+          </w:tcPr>
+          <w:p>
+            <w:r>
+              <w:t>20/64 (31.2%)</w:t>
+            </w:r>
+          </w:p>
+        </w:tc>
+      </w:tr>
+      <w:tr>
+        <w:tc>
+          <w:tcPr>
+            <w:tcW w:type="dxa" w:w="4320"/>
+          </w:tcPr>
+          <w:p>
+            <w:r>
+              <w:t>Exact SMILES</w:t>
+            </w:r>
+          </w:p>
+        </w:tc>
+        <w:tc>
+          <w:tcPr>
+            <w:tcW w:type="dxa" w:w="4320"/>
+          </w:tcPr>
+          <w:p>
+            <w:r>
+              <w:t>15/64 (23.4%)</w:t>
+            </w:r>
+          </w:p>
+        </w:tc>
+      </w:tr>
+      <w:tr>
+        <w:tc>
+          <w:tcPr>
+            <w:tcW w:type="dxa" w:w="4320"/>
+          </w:tcPr>
+          <w:p>
+            <w:r>
+              <w:t>Same connectivity only (IK1, not exact)</w:t>
+            </w:r>
+          </w:p>
+        </w:tc>
+        <w:tc>
+          <w:tcPr>
+            <w:tcW w:type="dxa" w:w="4320"/>
+          </w:tcPr>
+          <w:p>
+            <w:r>
+              <w:t>5/64 (7.8%)</w:t>
+            </w:r>
+          </w:p>
+        </w:tc>
+      </w:tr>
+      <w:tr>
+        <w:tc>
+          <w:tcPr>
+            <w:tcW w:type="dxa" w:w="4320"/>
+          </w:tcPr>
+          <w:p>
+            <w:r>
+              <w:t>Same-formula isomer (not IK1)</w:t>
+            </w:r>
+          </w:p>
+        </w:tc>
+        <w:tc>
+          <w:tcPr>
+            <w:tcW w:type="dxa" w:w="4320"/>
+          </w:tcPr>
+          <w:p>
+            <w:r>
+              <w:t>7/64 (10.9%)</w:t>
+            </w:r>
+          </w:p>
+        </w:tc>
+      </w:tr>
+      <w:tr>
+        <w:tc>
+          <w:tcPr>
+            <w:tcW w:type="dxa" w:w="4320"/>
+          </w:tcPr>
+          <w:p>
+            <w:r>
+              <w:t>Near-or-better (hit + isomer + T&gt;=0.7)</w:t>
+            </w:r>
+          </w:p>
+        </w:tc>
+        <w:tc>
+          <w:tcPr>
+            <w:tcW w:type="dxa" w:w="4320"/>
+          </w:tcPr>
+          <w:p>
+            <w:r>
+              <w:t>27/64 (42.2%)</w:t>
+            </w:r>
+          </w:p>
+        </w:tc>
+      </w:tr>
+      <w:tr>
+        <w:tc>
+          <w:tcPr>
+            <w:tcW w:type="dxa" w:w="4320"/>
+          </w:tcPr>
+          <w:p>
+            <w:r>
+              <w:t>Any formula match</w:t>
+            </w:r>
+          </w:p>
+        </w:tc>
+        <w:tc>
+          <w:tcPr>
+            <w:tcW w:type="dxa" w:w="4320"/>
+          </w:tcPr>
+          <w:p>
+            <w:r>
+              <w:t>27/64 (42.2%)</w:t>
+            </w:r>
+          </w:p>
+        </w:tc>
+      </w:tr>
+      <w:tr>
+        <w:tc>
+          <w:tcPr>
+            <w:tcW w:type="dxa" w:w="4320"/>
+          </w:tcPr>
+          <w:p>
+            <w:r>
+              <w:t>Clear distant miss (T&lt;0.3)</w:t>
+            </w:r>
+          </w:p>
+        </w:tc>
+        <w:tc>
+          <w:tcPr>
+            <w:tcW w:type="dxa" w:w="4320"/>
+          </w:tcPr>
+          <w:p>
+            <w:r>
+              <w:t>35/64 (54.7%)</w:t>
+            </w:r>
+          </w:p>
+        </w:tc>
+      </w:tr>
+      <w:tr>
+        <w:tc>
+          <w:tcPr>
+            <w:tcW w:type="dxa" w:w="4320"/>
+          </w:tcPr>
+          <w:p>
+            <w:r>
+              <w:t>Unique-molecule IK1 any-hit</w:t>
+            </w:r>
+          </w:p>
+        </w:tc>
+        <w:tc>
+          <w:tcPr>
+            <w:tcW w:type="dxa" w:w="4320"/>
+          </w:tcPr>
+          <w:p>
+            <w:r>
+              <w:t>16/53 (30.2%)</w:t>
+            </w:r>
+          </w:p>
+        </w:tc>
+      </w:tr>
+    </w:tbl>
+    <w:p/>
+    <w:p>
+      <w:r>
+        <w:rPr>
+          <w:b w:val="0"/>
+          <w:i w:val="0"/>
+        </w:rPr>
+        <w:t>Outcome breakdown: exact 15; same connectivity 5; same-formula isomer 7; moderate/weak similarity 2; distant miss 35.</w:t>
       </w:r>
     </w:p>
     <w:p>
       <w:r>
         <w:rPr>
           <w:b w:val="0"/>
-          <w:sz w:val="22"/>
+          <w:i w:val="0"/>
+        </w:rPr>
+        <w:t>Full Excel (hits + misses + isomers): Desktop\\MSG_HNSW_test64_GROK_RESULTS_FULL.xlsx</w:t>
+      </w:r>
+    </w:p>
+    <w:p>
+      <w:pPr>
+        <w:pStyle w:val="Heading1"/>
+      </w:pPr>
+      <w:r>
+        <w:t>How to read this</w:t>
+      </w:r>
+    </w:p>
+    <w:p>
+      <w:pPr>
+        <w:pStyle w:val="ListNumber"/>
+      </w:pPr>
+      <w:r>
+        <w:t>This is the hard, non-redundant slice (64 spectra / ~53 unique molecules). Not 1:1 comparable to strict 285 (~18 unique mols), where Grok free-form no-NIST was ~36% IK1 at spectrum level.</w:t>
+      </w:r>
+    </w:p>
+    <w:p>
+      <w:pPr>
+        <w:pStyle w:val="ListNumber"/>
+      </w:pPr>
+      <w:r>
+        <w:t>Network ceiling: free-form is largely reason-over-ego. When true structure is absent from neighbors, hit rate collapses; when present, retrieval can still pick wrong analog/isomer.</w:t>
+      </w:r>
+    </w:p>
+    <w:p>
+      <w:pPr>
+        <w:pStyle w:val="ListNumber"/>
+      </w:pPr>
+      <w:r>
+        <w:t>Do not mix invalid bulk Grok returns (full 11540 or finished-in-minutes packs) into free-form tables.</w:t>
+      </w:r>
+    </w:p>
+    <w:p>
+      <w:pPr>
+        <w:pStyle w:val="ListNumber"/>
+      </w:pPr>
+      <w:r>
+        <w:t>Claude on the same test64 is in progress under the same prompts — same category table when done.</w:t>
+      </w:r>
+    </w:p>
+    <w:p>
+      <w:pPr>
+        <w:pStyle w:val="ListNumber"/>
+      </w:pPr>
+      <w:r>
+        <w:t>Still not full official MSG test (17556); only the 64 test-fold spectra in HNSW block 219564-231103.</w:t>
+      </w:r>
+    </w:p>
+    <w:p>
+      <w:pPr>
+        <w:pStyle w:val="Heading1"/>
+      </w:pPr>
+      <w:r>
+        <w:t>Algorithm (one line)</w:t>
+      </w:r>
+    </w:p>
+    <w:p>
+      <w:r>
+        <w:rPr>
+          <w:b w:val="0"/>
+          <w:i w:val="0"/>
+        </w:rPr>
+        <w:t>GraphML ego + MGF -&gt; hide seed -&gt; neighbor ranking + MS/MS explain -&gt; neighbor-only NIST -&gt; free-form LLM (MASS-&gt;NETWORK-&gt;MS/MS-&gt;CHEMISTRY-&gt;DECISION) -&gt; one SMILES JSON -&gt; score vs sealed truth. MSG HNSW seed always 9999999; link by file-order index N.</w:t>
+      </w:r>
+    </w:p>
+    <w:p>
+      <w:pPr>
+        <w:pStyle w:val="Heading1"/>
+      </w:pPr>
+      <w:r>
+        <w:t>Repo / docs</w:t>
+      </w:r>
+    </w:p>
+    <w:p>
+      <w:r>
+        <w:rPr>
+          <w:b w:val="0"/>
+          <w:i w:val="0"/>
+        </w:rPr>
+        <w:t>https://github.com/Melin2012/ego-mol-llm</w:t>
+      </w:r>
+    </w:p>
+    <w:p>
+      <w:pPr>
+        <w:pStyle w:val="ListBullet"/>
+      </w:pPr>
+      <w:r>
+        <w:t>paper/RESULTS_BOARD.md (+ .docx)</w:t>
+      </w:r>
+    </w:p>
+    <w:p>
+      <w:pPr>
+        <w:pStyle w:val="ListBullet"/>
+      </w:pPr>
+      <w:r>
+        <w:t>paper/METHODS.md (+ .docx)</w:t>
+      </w:r>
+    </w:p>
+    <w:p>
+      <w:pPr>
+        <w:pStyle w:val="ListBullet"/>
+      </w:pPr>
+      <w:r>
+        <w:t>paper/HANDOFF_ALEXANDER.md (+ .docx)</w:t>
+      </w:r>
+    </w:p>
+    <w:p>
+      <w:pPr>
+        <w:pStyle w:val="ListBullet"/>
+      </w:pPr>
+      <w:r>
+        <w:t>scripts/_score_msg_test64_grok_handout.py, scripts/export_test64_results_table.py</w:t>
+      </w:r>
+    </w:p>
+    <w:p>
+      <w:pPr>
+        <w:pStyle w:val="Heading1"/>
+      </w:pPr>
+      <w:r>
+        <w:t>Student asks</w:t>
+      </w:r>
+    </w:p>
+    <w:p>
+      <w:pPr>
+        <w:pStyle w:val="ListNumber"/>
+      </w:pPr>
+      <w:r>
+        <w:t>Keep free-form vs ranker vs invalid bulk in separate columns.</w:t>
+      </w:r>
+    </w:p>
+    <w:p>
+      <w:pPr>
+        <w:pStyle w:val="ListNumber"/>
+      </w:pPr>
+      <w:r>
+        <w:t>Report spectrum-level and unique-molecule metrics.</w:t>
+      </w:r>
+    </w:p>
+    <w:p>
+      <w:pPr>
+        <w:pStyle w:val="ListNumber"/>
+      </w:pPr>
+      <w:r>
+        <w:t>When Claude finishes, same scoring categories as the Excel.</w:t>
+      </w:r>
+    </w:p>
+    <w:p>
+      <w:pPr>
+        <w:pStyle w:val="ListNumber"/>
+      </w:pPr>
+      <w:r>
+        <w:t>Optional: deterministic product ranker on the same 64 for a non-LLM baseline.</w:t>
+      </w:r>
+    </w:p>
+    <w:p>
+      <w:r>
+        <w:rPr>
+          <w:b w:val="0"/>
+          <w:i w:val="0"/>
+        </w:rPr>
+        <w:t>Happy to walk through the Excel and failure modes (true-not-in-network vs wrong isomer) on a short call.</w:t>
+      </w:r>
+    </w:p>
+    <w:p>
+      <w:r>
+        <w:rPr>
+          <w:b w:val="0"/>
+          <w:i w:val="0"/>
         </w:rPr>
         <w:t>Best,</w:t>
       </w:r>
@@ -107,7 +506,7 @@
       <w:r>
         <w:rPr>
           <w:b w:val="0"/>
-          <w:sz w:val="22"/>
+          <w:i w:val="0"/>
         </w:rPr>
         <w:t>Alexey</w:t>
       </w:r>
@@ -549,10 +948,10 @@
       <w:outlineLvl w:val="0"/>
     </w:pPr>
     <w:rPr>
-      <w:rFonts w:asciiTheme="majorHAnsi" w:eastAsiaTheme="majorEastAsia" w:hAnsiTheme="majorHAnsi" w:cstheme="majorBidi" w:ascii="Calibri" w:hAnsi="Calibri"/>
+      <w:rFonts w:asciiTheme="majorHAnsi" w:eastAsiaTheme="majorEastAsia" w:hAnsiTheme="majorHAnsi" w:cstheme="majorBidi"/>
       <w:b/>
       <w:bCs/>
-      <w:color w:val="1A1A2E"/>
+      <w:color w:val="365F91" w:themeColor="accent1" w:themeShade="BF"/>
       <w:sz w:val="28"/>
       <w:szCs w:val="28"/>
     </w:rPr>
@@ -573,10 +972,10 @@
       <w:outlineLvl w:val="1"/>
     </w:pPr>
     <w:rPr>
-      <w:rFonts w:asciiTheme="majorHAnsi" w:eastAsiaTheme="majorEastAsia" w:hAnsiTheme="majorHAnsi" w:cstheme="majorBidi" w:ascii="Calibri" w:hAnsi="Calibri"/>
+      <w:rFonts w:asciiTheme="majorHAnsi" w:eastAsiaTheme="majorEastAsia" w:hAnsiTheme="majorHAnsi" w:cstheme="majorBidi"/>
       <w:b/>
       <w:bCs/>
-      <w:color w:val="1A1A2E"/>
+      <w:color w:val="4F81BD" w:themeColor="accent1"/>
       <w:sz w:val="26"/>
       <w:szCs w:val="26"/>
     </w:rPr>
@@ -597,10 +996,10 @@
       <w:outlineLvl w:val="2"/>
     </w:pPr>
     <w:rPr>
-      <w:rFonts w:asciiTheme="majorHAnsi" w:eastAsiaTheme="majorEastAsia" w:hAnsiTheme="majorHAnsi" w:cstheme="majorBidi" w:ascii="Calibri" w:hAnsi="Calibri"/>
+      <w:rFonts w:asciiTheme="majorHAnsi" w:eastAsiaTheme="majorEastAsia" w:hAnsiTheme="majorHAnsi" w:cstheme="majorBidi"/>
       <w:b/>
       <w:bCs/>
-      <w:color w:val="1A1A2E"/>
+      <w:color w:val="4F81BD" w:themeColor="accent1"/>
     </w:rPr>
   </w:style>
   <w:style w:type="paragraph" w:styleId="Heading4">

</xml_diff>